<commit_message>
Final Project Delivery files
</commit_message>
<xml_diff>
--- a/report/FINAL/noted_platform_setup_and_installation_manual.docx
+++ b/report/FINAL/noted_platform_setup_and_installation_manual.docx
@@ -132,7 +132,7 @@
           <w:r>
             <w:fldChar w:fldCharType="separate"/>
           </w:r>
-          <w:hyperlink w:anchor="_Toc227180825" w:history="1">
+          <w:hyperlink w:anchor="_Toc227188914" w:history="1">
             <w:r>
               <w:rPr>
                 <w:rStyle w:val="Hyperlink"/>
@@ -159,7 +159,7 @@
                 <w:noProof/>
                 <w:webHidden/>
               </w:rPr>
-              <w:instrText xml:space="preserve"> PAGEREF _Toc227180825 \h </w:instrText>
+              <w:instrText xml:space="preserve"> PAGEREF _Toc227188914 \h </w:instrText>
             </w:r>
             <w:r>
               <w:rPr>
@@ -204,7 +204,7 @@
               <w14:ligatures w14:val="standardContextual"/>
             </w:rPr>
           </w:pPr>
-          <w:hyperlink w:anchor="_Toc227180826" w:history="1">
+          <w:hyperlink w:anchor="_Toc227188915" w:history="1">
             <w:r>
               <w:rPr>
                 <w:rStyle w:val="Hyperlink"/>
@@ -231,7 +231,7 @@
                 <w:noProof/>
                 <w:webHidden/>
               </w:rPr>
-              <w:instrText xml:space="preserve"> PAGEREF _Toc227180826 \h </w:instrText>
+              <w:instrText xml:space="preserve"> PAGEREF _Toc227188915 \h </w:instrText>
             </w:r>
             <w:r>
               <w:rPr>
@@ -276,7 +276,7 @@
               <w14:ligatures w14:val="standardContextual"/>
             </w:rPr>
           </w:pPr>
-          <w:hyperlink w:anchor="_Toc227180827" w:history="1">
+          <w:hyperlink w:anchor="_Toc227188916" w:history="1">
             <w:r>
               <w:rPr>
                 <w:rStyle w:val="Hyperlink"/>
@@ -303,7 +303,7 @@
                 <w:noProof/>
                 <w:webHidden/>
               </w:rPr>
-              <w:instrText xml:space="preserve"> PAGEREF _Toc227180827 \h </w:instrText>
+              <w:instrText xml:space="preserve"> PAGEREF _Toc227188916 \h </w:instrText>
             </w:r>
             <w:r>
               <w:rPr>
@@ -348,7 +348,7 @@
               <w14:ligatures w14:val="standardContextual"/>
             </w:rPr>
           </w:pPr>
-          <w:hyperlink w:anchor="_Toc227180828" w:history="1">
+          <w:hyperlink w:anchor="_Toc227188917" w:history="1">
             <w:r>
               <w:rPr>
                 <w:rStyle w:val="Hyperlink"/>
@@ -375,7 +375,7 @@
                 <w:noProof/>
                 <w:webHidden/>
               </w:rPr>
-              <w:instrText xml:space="preserve"> PAGEREF _Toc227180828 \h </w:instrText>
+              <w:instrText xml:space="preserve"> PAGEREF _Toc227188917 \h </w:instrText>
             </w:r>
             <w:r>
               <w:rPr>
@@ -420,7 +420,7 @@
               <w14:ligatures w14:val="standardContextual"/>
             </w:rPr>
           </w:pPr>
-          <w:hyperlink w:anchor="_Toc227180829" w:history="1">
+          <w:hyperlink w:anchor="_Toc227188918" w:history="1">
             <w:r>
               <w:rPr>
                 <w:rStyle w:val="Hyperlink"/>
@@ -447,7 +447,7 @@
                 <w:noProof/>
                 <w:webHidden/>
               </w:rPr>
-              <w:instrText xml:space="preserve"> PAGEREF _Toc227180829 \h </w:instrText>
+              <w:instrText xml:space="preserve"> PAGEREF _Toc227188918 \h </w:instrText>
             </w:r>
             <w:r>
               <w:rPr>
@@ -492,7 +492,7 @@
               <w14:ligatures w14:val="standardContextual"/>
             </w:rPr>
           </w:pPr>
-          <w:hyperlink w:anchor="_Toc227180830" w:history="1">
+          <w:hyperlink w:anchor="_Toc227188919" w:history="1">
             <w:r>
               <w:rPr>
                 <w:rStyle w:val="Hyperlink"/>
@@ -519,7 +519,7 @@
                 <w:noProof/>
                 <w:webHidden/>
               </w:rPr>
-              <w:instrText xml:space="preserve"> PAGEREF _Toc227180830 \h </w:instrText>
+              <w:instrText xml:space="preserve"> PAGEREF _Toc227188919 \h </w:instrText>
             </w:r>
             <w:r>
               <w:rPr>
@@ -564,7 +564,7 @@
               <w14:ligatures w14:val="standardContextual"/>
             </w:rPr>
           </w:pPr>
-          <w:hyperlink w:anchor="_Toc227180831" w:history="1">
+          <w:hyperlink w:anchor="_Toc227188920" w:history="1">
             <w:r>
               <w:rPr>
                 <w:rStyle w:val="Hyperlink"/>
@@ -591,7 +591,7 @@
                 <w:noProof/>
                 <w:webHidden/>
               </w:rPr>
-              <w:instrText xml:space="preserve"> PAGEREF _Toc227180831 \h </w:instrText>
+              <w:instrText xml:space="preserve"> PAGEREF _Toc227188920 \h </w:instrText>
             </w:r>
             <w:r>
               <w:rPr>
@@ -636,7 +636,7 @@
               <w14:ligatures w14:val="standardContextual"/>
             </w:rPr>
           </w:pPr>
-          <w:hyperlink w:anchor="_Toc227180832" w:history="1">
+          <w:hyperlink w:anchor="_Toc227188921" w:history="1">
             <w:r>
               <w:rPr>
                 <w:rStyle w:val="Hyperlink"/>
@@ -663,7 +663,7 @@
                 <w:noProof/>
                 <w:webHidden/>
               </w:rPr>
-              <w:instrText xml:space="preserve"> PAGEREF _Toc227180832 \h </w:instrText>
+              <w:instrText xml:space="preserve"> PAGEREF _Toc227188921 \h </w:instrText>
             </w:r>
             <w:r>
               <w:rPr>
@@ -708,7 +708,7 @@
               <w14:ligatures w14:val="standardContextual"/>
             </w:rPr>
           </w:pPr>
-          <w:hyperlink w:anchor="_Toc227180833" w:history="1">
+          <w:hyperlink w:anchor="_Toc227188922" w:history="1">
             <w:r>
               <w:rPr>
                 <w:rStyle w:val="Hyperlink"/>
@@ -735,7 +735,7 @@
                 <w:noProof/>
                 <w:webHidden/>
               </w:rPr>
-              <w:instrText xml:space="preserve"> PAGEREF _Toc227180833 \h </w:instrText>
+              <w:instrText xml:space="preserve"> PAGEREF _Toc227188922 \h </w:instrText>
             </w:r>
             <w:r>
               <w:rPr>
@@ -780,7 +780,7 @@
               <w14:ligatures w14:val="standardContextual"/>
             </w:rPr>
           </w:pPr>
-          <w:hyperlink w:anchor="_Toc227180834" w:history="1">
+          <w:hyperlink w:anchor="_Toc227188923" w:history="1">
             <w:r>
               <w:rPr>
                 <w:rStyle w:val="Hyperlink"/>
@@ -807,7 +807,7 @@
                 <w:noProof/>
                 <w:webHidden/>
               </w:rPr>
-              <w:instrText xml:space="preserve"> PAGEREF _Toc227180834 \h </w:instrText>
+              <w:instrText xml:space="preserve"> PAGEREF _Toc227188923 \h </w:instrText>
             </w:r>
             <w:r>
               <w:rPr>
@@ -852,7 +852,7 @@
               <w14:ligatures w14:val="standardContextual"/>
             </w:rPr>
           </w:pPr>
-          <w:hyperlink w:anchor="_Toc227180835" w:history="1">
+          <w:hyperlink w:anchor="_Toc227188924" w:history="1">
             <w:r>
               <w:rPr>
                 <w:rStyle w:val="Hyperlink"/>
@@ -879,7 +879,7 @@
                 <w:noProof/>
                 <w:webHidden/>
               </w:rPr>
-              <w:instrText xml:space="preserve"> PAGEREF _Toc227180835 \h </w:instrText>
+              <w:instrText xml:space="preserve"> PAGEREF _Toc227188924 \h </w:instrText>
             </w:r>
             <w:r>
               <w:rPr>
@@ -924,7 +924,7 @@
               <w14:ligatures w14:val="standardContextual"/>
             </w:rPr>
           </w:pPr>
-          <w:hyperlink w:anchor="_Toc227180836" w:history="1">
+          <w:hyperlink w:anchor="_Toc227188925" w:history="1">
             <w:r>
               <w:rPr>
                 <w:rStyle w:val="Hyperlink"/>
@@ -951,7 +951,7 @@
                 <w:noProof/>
                 <w:webHidden/>
               </w:rPr>
-              <w:instrText xml:space="preserve"> PAGEREF _Toc227180836 \h </w:instrText>
+              <w:instrText xml:space="preserve"> PAGEREF _Toc227188925 \h </w:instrText>
             </w:r>
             <w:r>
               <w:rPr>
@@ -996,7 +996,7 @@
               <w14:ligatures w14:val="standardContextual"/>
             </w:rPr>
           </w:pPr>
-          <w:hyperlink w:anchor="_Toc227180837" w:history="1">
+          <w:hyperlink w:anchor="_Toc227188926" w:history="1">
             <w:r>
               <w:rPr>
                 <w:rStyle w:val="Hyperlink"/>
@@ -1023,7 +1023,7 @@
                 <w:noProof/>
                 <w:webHidden/>
               </w:rPr>
-              <w:instrText xml:space="preserve"> PAGEREF _Toc227180837 \h </w:instrText>
+              <w:instrText xml:space="preserve"> PAGEREF _Toc227188926 \h </w:instrText>
             </w:r>
             <w:r>
               <w:rPr>
@@ -1068,7 +1068,7 @@
               <w14:ligatures w14:val="standardContextual"/>
             </w:rPr>
           </w:pPr>
-          <w:hyperlink w:anchor="_Toc227180838" w:history="1">
+          <w:hyperlink w:anchor="_Toc227188927" w:history="1">
             <w:r>
               <w:rPr>
                 <w:rStyle w:val="Hyperlink"/>
@@ -1095,7 +1095,7 @@
                 <w:noProof/>
                 <w:webHidden/>
               </w:rPr>
-              <w:instrText xml:space="preserve"> PAGEREF _Toc227180838 \h </w:instrText>
+              <w:instrText xml:space="preserve"> PAGEREF _Toc227188927 \h </w:instrText>
             </w:r>
             <w:r>
               <w:rPr>
@@ -1140,7 +1140,7 @@
               <w14:ligatures w14:val="standardContextual"/>
             </w:rPr>
           </w:pPr>
-          <w:hyperlink w:anchor="_Toc227180839" w:history="1">
+          <w:hyperlink w:anchor="_Toc227188928" w:history="1">
             <w:r>
               <w:rPr>
                 <w:rStyle w:val="Hyperlink"/>
@@ -1167,7 +1167,7 @@
                 <w:noProof/>
                 <w:webHidden/>
               </w:rPr>
-              <w:instrText xml:space="preserve"> PAGEREF _Toc227180839 \h </w:instrText>
+              <w:instrText xml:space="preserve"> PAGEREF _Toc227188928 \h </w:instrText>
             </w:r>
             <w:r>
               <w:rPr>
@@ -1212,7 +1212,7 @@
               <w14:ligatures w14:val="standardContextual"/>
             </w:rPr>
           </w:pPr>
-          <w:hyperlink w:anchor="_Toc227180840" w:history="1">
+          <w:hyperlink w:anchor="_Toc227188929" w:history="1">
             <w:r>
               <w:rPr>
                 <w:rStyle w:val="Hyperlink"/>
@@ -1239,7 +1239,7 @@
                 <w:noProof/>
                 <w:webHidden/>
               </w:rPr>
-              <w:instrText xml:space="preserve"> PAGEREF _Toc227180840 \h </w:instrText>
+              <w:instrText xml:space="preserve"> PAGEREF _Toc227188929 \h </w:instrText>
             </w:r>
             <w:r>
               <w:rPr>
@@ -1284,7 +1284,7 @@
               <w14:ligatures w14:val="standardContextual"/>
             </w:rPr>
           </w:pPr>
-          <w:hyperlink w:anchor="_Toc227180841" w:history="1">
+          <w:hyperlink w:anchor="_Toc227188930" w:history="1">
             <w:r>
               <w:rPr>
                 <w:rStyle w:val="Hyperlink"/>
@@ -1311,7 +1311,7 @@
                 <w:noProof/>
                 <w:webHidden/>
               </w:rPr>
-              <w:instrText xml:space="preserve"> PAGEREF _Toc227180841 \h </w:instrText>
+              <w:instrText xml:space="preserve"> PAGEREF _Toc227188930 \h </w:instrText>
             </w:r>
             <w:r>
               <w:rPr>
@@ -1366,8 +1366,8 @@
         <w:spacing w:before="240" w:after="120" w:line="320" w:lineRule="exact"/>
         <w:jc w:val="both"/>
       </w:pPr>
-      <w:bookmarkStart w:id="0" w:name="_Toc227180825"/>
-      <w:bookmarkStart w:id="1" w:name="noted-setup-guide-for-reviewers"/>
+      <w:bookmarkStart w:id="0" w:name="noted-setup-guide-for-reviewers"/>
+      <w:bookmarkStart w:id="1" w:name="_Toc227188914"/>
       <w:r>
         <w:rPr>
           <w:rFonts w:ascii="Aptos" w:hAnsi="Aptos"/>
@@ -1385,7 +1385,7 @@
         </w:rPr>
         <w:t>. Introduction</w:t>
       </w:r>
-      <w:bookmarkEnd w:id="0"/>
+      <w:bookmarkEnd w:id="1"/>
     </w:p>
     <w:p>
       <w:pPr>
@@ -1484,8 +1484,8 @@
           <w:szCs w:val="28"/>
         </w:rPr>
       </w:pPr>
-      <w:bookmarkStart w:id="2" w:name="_Toc227180826"/>
-      <w:bookmarkStart w:id="3" w:name="quick-links"/>
+      <w:bookmarkStart w:id="2" w:name="quick-links"/>
+      <w:bookmarkStart w:id="3" w:name="_Toc227188915"/>
       <w:r>
         <w:rPr>
           <w:rFonts w:ascii="Aptos" w:hAnsi="Aptos"/>
@@ -1495,7 +1495,7 @@
         </w:rPr>
         <w:t>Quick links</w:t>
       </w:r>
-      <w:bookmarkEnd w:id="2"/>
+      <w:bookmarkEnd w:id="3"/>
     </w:p>
     <w:p>
       <w:pPr>
@@ -1536,6 +1536,7 @@
         <w:spacing w:before="0" w:after="120" w:line="278" w:lineRule="auto"/>
         <w:jc w:val="both"/>
       </w:pPr>
+      <w:proofErr w:type="spellStart"/>
       <w:r>
         <w:rPr>
           <w:b/>
@@ -1543,8 +1544,33 @@
         </w:rPr>
         <w:t>jena_weather</w:t>
       </w:r>
-      <w:r>
-        <w:t xml:space="preserve"> (training project): clone from the tutorial materials you received.</w:t>
+      <w:proofErr w:type="spellEnd"/>
+      <w:r>
+        <w:rPr>
+          <w:b/>
+          <w:bCs/>
+        </w:rPr>
+        <w:t xml:space="preserve">: </w:t>
+      </w:r>
+      <w:hyperlink r:id="rId10" w:history="1">
+        <w:r>
+          <w:rPr>
+            <w:rStyle w:val="Hyperlink"/>
+          </w:rPr>
+          <w:t>https://github.com/logus2k/</w:t>
+        </w:r>
+        <w:r>
+          <w:rPr>
+            <w:rStyle w:val="Hyperlink"/>
+          </w:rPr>
+          <w:t>jena_weather</w:t>
+        </w:r>
+      </w:hyperlink>
+      <w:r>
+        <w:t xml:space="preserve"> </w:t>
+      </w:r>
+      <w:r>
+        <w:t>(training project): clone from the tutorial materials you received.</w:t>
       </w:r>
     </w:p>
     <w:p>
@@ -1557,6 +1583,7 @@
         <w:spacing w:before="0" w:after="120" w:line="278" w:lineRule="auto"/>
         <w:jc w:val="both"/>
       </w:pPr>
+      <w:proofErr w:type="spellStart"/>
       <w:r>
         <w:rPr>
           <w:b/>
@@ -1564,6 +1591,28 @@
         </w:rPr>
         <w:t>jena_client</w:t>
       </w:r>
+      <w:proofErr w:type="spellEnd"/>
+      <w:r>
+        <w:rPr>
+          <w:b/>
+          <w:bCs/>
+        </w:rPr>
+        <w:t xml:space="preserve">: </w:t>
+      </w:r>
+      <w:hyperlink r:id="rId11" w:history="1">
+        <w:r>
+          <w:rPr>
+            <w:rStyle w:val="Hyperlink"/>
+          </w:rPr>
+          <w:t>https://github.com/logus2k/jena_</w:t>
+        </w:r>
+        <w:r>
+          <w:rPr>
+            <w:rStyle w:val="Hyperlink"/>
+          </w:rPr>
+          <w:t>client</w:t>
+        </w:r>
+      </w:hyperlink>
       <w:r>
         <w:t xml:space="preserve"> (serving client demo): clone from the tutorial materials you received.</w:t>
       </w:r>
@@ -1622,9 +1671,9 @@
           <w:sz w:val="36"/>
         </w:rPr>
       </w:pPr>
-      <w:bookmarkStart w:id="4" w:name="_Toc227180827"/>
-      <w:bookmarkStart w:id="5" w:name="prerequisites"/>
-      <w:bookmarkEnd w:id="3"/>
+      <w:bookmarkStart w:id="4" w:name="prerequisites"/>
+      <w:bookmarkStart w:id="5" w:name="_Toc227188916"/>
+      <w:bookmarkEnd w:id="2"/>
       <w:r>
         <w:rPr>
           <w:rFonts w:ascii="Aptos" w:hAnsi="Aptos"/>
@@ -1642,7 +1691,7 @@
         </w:rPr>
         <w:t>. Prerequisites</w:t>
       </w:r>
-      <w:bookmarkEnd w:id="4"/>
+      <w:bookmarkEnd w:id="5"/>
     </w:p>
     <w:p>
       <w:pPr>
@@ -1715,9 +1764,23 @@
         <w:t>NVIDIA Container Toolkit</w:t>
       </w:r>
       <w:r>
-        <w:t xml:space="preserve"> (optional, required only if you want GPU acceleration for training). See: </w:t>
-      </w:r>
-      <w:hyperlink r:id="rId10">
+        <w:t xml:space="preserve"> (optional, required only if you want GPU acceleration for training).</w:t>
+      </w:r>
+      <w:r>
+        <w:t xml:space="preserve"> </w:t>
+      </w:r>
+      <w:r>
+        <w:t>See:</w:t>
+      </w:r>
+    </w:p>
+    <w:p>
+      <w:pPr>
+        <w:pStyle w:val="Compact"/>
+        <w:spacing w:before="0" w:after="120" w:line="278" w:lineRule="auto"/>
+        <w:ind w:left="648"/>
+        <w:jc w:val="both"/>
+      </w:pPr>
+      <w:hyperlink r:id="rId12" w:history="1">
         <w:r>
           <w:rPr>
             <w:rStyle w:val="Hyperlink"/>
@@ -1804,9 +1867,9 @@
           <w:sz w:val="36"/>
         </w:rPr>
       </w:pPr>
-      <w:bookmarkStart w:id="6" w:name="_Toc227180828"/>
-      <w:bookmarkStart w:id="7" w:name="clone-the-repositories"/>
-      <w:bookmarkEnd w:id="5"/>
+      <w:bookmarkStart w:id="6" w:name="clone-the-repositories"/>
+      <w:bookmarkStart w:id="7" w:name="_Toc227188917"/>
+      <w:bookmarkEnd w:id="4"/>
       <w:r>
         <w:rPr>
           <w:rFonts w:ascii="Aptos" w:hAnsi="Aptos"/>
@@ -1824,7 +1887,7 @@
         </w:rPr>
         <w:t>. Clone the repositories</w:t>
       </w:r>
-      <w:bookmarkEnd w:id="6"/>
+      <w:bookmarkEnd w:id="7"/>
     </w:p>
     <w:p>
       <w:pPr>
@@ -2172,9 +2235,9 @@
           <w:sz w:val="36"/>
         </w:rPr>
       </w:pPr>
-      <w:bookmarkStart w:id="8" w:name="_Toc227180829"/>
-      <w:bookmarkStart w:id="9" w:name="configure-environment-variables"/>
-      <w:bookmarkEnd w:id="7"/>
+      <w:bookmarkStart w:id="8" w:name="configure-environment-variables"/>
+      <w:bookmarkStart w:id="9" w:name="_Toc227188918"/>
+      <w:bookmarkEnd w:id="6"/>
       <w:r>
         <w:rPr>
           <w:rFonts w:ascii="Aptos" w:hAnsi="Aptos"/>
@@ -2192,7 +2255,7 @@
         </w:rPr>
         <w:t>. Configure environment variables</w:t>
       </w:r>
-      <w:bookmarkEnd w:id="8"/>
+      <w:bookmarkEnd w:id="9"/>
     </w:p>
     <w:p>
       <w:pPr>
@@ -2578,9 +2641,9 @@
           <w:sz w:val="36"/>
         </w:rPr>
       </w:pPr>
-      <w:bookmarkStart w:id="10" w:name="_Toc227180830"/>
-      <w:bookmarkStart w:id="11" w:name="configure-project-mounts"/>
-      <w:bookmarkEnd w:id="9"/>
+      <w:bookmarkStart w:id="10" w:name="configure-project-mounts"/>
+      <w:bookmarkStart w:id="11" w:name="_Toc227188919"/>
+      <w:bookmarkEnd w:id="8"/>
       <w:r>
         <w:rPr>
           <w:rFonts w:ascii="Aptos" w:hAnsi="Aptos"/>
@@ -2598,7 +2661,7 @@
         </w:rPr>
         <w:t>. Configure project mounts</w:t>
       </w:r>
-      <w:bookmarkEnd w:id="10"/>
+      <w:bookmarkEnd w:id="11"/>
     </w:p>
     <w:p>
       <w:pPr>
@@ -3113,9 +3176,9 @@
           <w:sz w:val="36"/>
         </w:rPr>
       </w:pPr>
-      <w:bookmarkStart w:id="12" w:name="_Toc227180831"/>
-      <w:bookmarkStart w:id="13" w:name="launch-noted-and-its-dependencies"/>
-      <w:bookmarkEnd w:id="11"/>
+      <w:bookmarkStart w:id="12" w:name="launch-noted-and-its-dependencies"/>
+      <w:bookmarkStart w:id="13" w:name="_Toc227188920"/>
+      <w:bookmarkEnd w:id="10"/>
       <w:r>
         <w:rPr>
           <w:rFonts w:ascii="Aptos" w:hAnsi="Aptos"/>
@@ -3133,7 +3196,7 @@
         </w:rPr>
         <w:t>. Launch noted and its dependencies</w:t>
       </w:r>
-      <w:bookmarkEnd w:id="12"/>
+      <w:bookmarkEnd w:id="13"/>
     </w:p>
     <w:p>
       <w:pPr>
@@ -3141,15 +3204,15 @@
         <w:spacing w:before="240" w:after="120" w:line="320" w:lineRule="exact"/>
         <w:jc w:val="both"/>
       </w:pPr>
-      <w:bookmarkStart w:id="14" w:name="_Toc227180832"/>
-      <w:bookmarkStart w:id="15" w:name="with-gpu"/>
+      <w:bookmarkStart w:id="14" w:name="with-gpu"/>
+      <w:bookmarkStart w:id="15" w:name="_Toc227188921"/>
       <w:r>
         <w:rPr>
           <w:color w:val="4F81BD"/>
         </w:rPr>
         <w:t>With GPU</w:t>
       </w:r>
-      <w:bookmarkEnd w:id="14"/>
+      <w:bookmarkEnd w:id="15"/>
     </w:p>
     <w:p>
       <w:pPr>
@@ -3354,16 +3417,16 @@
         <w:spacing w:before="240" w:after="120" w:line="320" w:lineRule="exact"/>
         <w:jc w:val="both"/>
       </w:pPr>
-      <w:bookmarkStart w:id="16" w:name="_Toc227180833"/>
-      <w:bookmarkStart w:id="17" w:name="cpu-only"/>
-      <w:bookmarkEnd w:id="15"/>
+      <w:bookmarkStart w:id="16" w:name="cpu-only"/>
+      <w:bookmarkStart w:id="17" w:name="_Toc227188922"/>
+      <w:bookmarkEnd w:id="14"/>
       <w:r>
         <w:rPr>
           <w:color w:val="4F81BD"/>
         </w:rPr>
         <w:t>CPU only</w:t>
       </w:r>
-      <w:bookmarkEnd w:id="16"/>
+      <w:bookmarkEnd w:id="17"/>
     </w:p>
     <w:p>
       <w:pPr>
@@ -3748,10 +3811,10 @@
           <w:sz w:val="36"/>
         </w:rPr>
       </w:pPr>
-      <w:bookmarkStart w:id="18" w:name="_Toc227180834"/>
-      <w:bookmarkStart w:id="19" w:name="open-noted"/>
-      <w:bookmarkEnd w:id="13"/>
-      <w:bookmarkEnd w:id="17"/>
+      <w:bookmarkStart w:id="18" w:name="open-noted"/>
+      <w:bookmarkStart w:id="19" w:name="_Toc227188923"/>
+      <w:bookmarkEnd w:id="12"/>
+      <w:bookmarkEnd w:id="16"/>
       <w:r>
         <w:rPr>
           <w:rFonts w:ascii="Aptos" w:hAnsi="Aptos"/>
@@ -3769,7 +3832,7 @@
         </w:rPr>
         <w:t>. Open noted</w:t>
       </w:r>
-      <w:bookmarkEnd w:id="18"/>
+      <w:bookmarkEnd w:id="19"/>
     </w:p>
     <w:p>
       <w:pPr>
@@ -3787,7 +3850,7 @@
         <w:spacing w:before="180" w:after="180" w:line="320" w:lineRule="exact"/>
         <w:jc w:val="both"/>
       </w:pPr>
-      <w:hyperlink r:id="rId11">
+      <w:hyperlink r:id="rId13">
         <w:r>
           <w:rPr>
             <w:rStyle w:val="Hyperlink"/>
@@ -3914,9 +3977,9 @@
           <w:sz w:val="36"/>
         </w:rPr>
       </w:pPr>
-      <w:bookmarkStart w:id="20" w:name="_Toc227180835"/>
-      <w:bookmarkStart w:id="21" w:name="first-run-checklist"/>
-      <w:bookmarkEnd w:id="19"/>
+      <w:bookmarkStart w:id="20" w:name="first-run-checklist"/>
+      <w:bookmarkStart w:id="21" w:name="_Toc227188924"/>
+      <w:bookmarkEnd w:id="18"/>
       <w:r>
         <w:rPr>
           <w:rFonts w:ascii="Aptos" w:hAnsi="Aptos"/>
@@ -3934,7 +3997,7 @@
         </w:rPr>
         <w:t>. First-run checklist</w:t>
       </w:r>
-      <w:bookmarkEnd w:id="20"/>
+      <w:bookmarkEnd w:id="21"/>
     </w:p>
     <w:p>
       <w:pPr>
@@ -4110,9 +4173,9 @@
           <w:sz w:val="36"/>
         </w:rPr>
       </w:pPr>
-      <w:bookmarkStart w:id="22" w:name="_Toc227180836"/>
-      <w:bookmarkStart w:id="23" w:name="stopping-and-cleaning-up"/>
-      <w:bookmarkEnd w:id="21"/>
+      <w:bookmarkStart w:id="22" w:name="stopping-and-cleaning-up"/>
+      <w:bookmarkStart w:id="23" w:name="_Toc227188925"/>
+      <w:bookmarkEnd w:id="20"/>
       <w:r>
         <w:rPr>
           <w:rFonts w:ascii="Aptos" w:hAnsi="Aptos"/>
@@ -4130,7 +4193,7 @@
         </w:rPr>
         <w:t>. Stopping and cleaning up</w:t>
       </w:r>
-      <w:bookmarkEnd w:id="22"/>
+      <w:bookmarkEnd w:id="23"/>
     </w:p>
     <w:p>
       <w:pPr>
@@ -4138,15 +4201,15 @@
         <w:spacing w:before="240" w:after="120" w:line="320" w:lineRule="exact"/>
         <w:jc w:val="both"/>
       </w:pPr>
-      <w:bookmarkStart w:id="24" w:name="_Toc227180837"/>
-      <w:bookmarkStart w:id="25" w:name="stop-preserves-data-and-images"/>
+      <w:bookmarkStart w:id="24" w:name="stop-preserves-data-and-images"/>
+      <w:bookmarkStart w:id="25" w:name="_Toc227188926"/>
       <w:r>
         <w:rPr>
           <w:color w:val="4F81BD"/>
         </w:rPr>
         <w:t>Stop (preserves data and images)</w:t>
       </w:r>
-      <w:bookmarkEnd w:id="24"/>
+      <w:bookmarkEnd w:id="25"/>
     </w:p>
     <w:p>
       <w:pPr>
@@ -4324,16 +4387,16 @@
         <w:spacing w:before="240" w:after="120" w:line="320" w:lineRule="exact"/>
         <w:jc w:val="both"/>
       </w:pPr>
-      <w:bookmarkStart w:id="26" w:name="_Toc227180838"/>
-      <w:bookmarkStart w:id="27" w:name="X171c11dc3308c3aa9c620be300d380286024daa"/>
-      <w:bookmarkEnd w:id="25"/>
+      <w:bookmarkStart w:id="26" w:name="X171c11dc3308c3aa9c620be300d380286024daa"/>
+      <w:bookmarkStart w:id="27" w:name="_Toc227188927"/>
+      <w:bookmarkEnd w:id="24"/>
       <w:r>
         <w:rPr>
           <w:color w:val="4F81BD"/>
         </w:rPr>
         <w:t>Stop and wipe volumes (removes MLflow runs, MinIO objects,</w:t>
       </w:r>
-      <w:bookmarkEnd w:id="26"/>
+      <w:bookmarkEnd w:id="27"/>
     </w:p>
     <w:p>
       <w:pPr>
@@ -4508,16 +4571,16 @@
         <w:spacing w:before="240" w:after="120" w:line="320" w:lineRule="exact"/>
         <w:jc w:val="both"/>
       </w:pPr>
-      <w:bookmarkStart w:id="28" w:name="_Toc227180839"/>
-      <w:bookmarkStart w:id="29" w:name="remove-the-noted-image-frees-disk"/>
-      <w:bookmarkEnd w:id="27"/>
+      <w:bookmarkStart w:id="28" w:name="remove-the-noted-image-frees-disk"/>
+      <w:bookmarkStart w:id="29" w:name="_Toc227188928"/>
+      <w:bookmarkEnd w:id="26"/>
       <w:r>
         <w:rPr>
           <w:color w:val="4F81BD"/>
         </w:rPr>
         <w:t>Remove the noted image (frees disk)</w:t>
       </w:r>
-      <w:bookmarkEnd w:id="28"/>
+      <w:bookmarkEnd w:id="29"/>
     </w:p>
     <w:p>
       <w:pPr>
@@ -4601,10 +4664,10 @@
           <w:sz w:val="36"/>
         </w:rPr>
       </w:pPr>
-      <w:bookmarkStart w:id="30" w:name="_Toc227180840"/>
-      <w:bookmarkStart w:id="31" w:name="troubleshooting"/>
-      <w:bookmarkEnd w:id="23"/>
-      <w:bookmarkEnd w:id="29"/>
+      <w:bookmarkStart w:id="30" w:name="troubleshooting"/>
+      <w:bookmarkStart w:id="31" w:name="_Toc227188929"/>
+      <w:bookmarkEnd w:id="22"/>
+      <w:bookmarkEnd w:id="28"/>
       <w:r>
         <w:rPr>
           <w:rFonts w:ascii="Aptos" w:hAnsi="Aptos"/>
@@ -4630,7 +4693,7 @@
         </w:rPr>
         <w:t>Troubleshooting</w:t>
       </w:r>
-      <w:bookmarkEnd w:id="30"/>
+      <w:bookmarkEnd w:id="31"/>
     </w:p>
     <w:p>
       <w:pPr>
@@ -4645,7 +4708,7 @@
         </w:rPr>
         <w:t xml:space="preserve">noted is unreachable at </w:t>
       </w:r>
-      <w:hyperlink r:id="rId12">
+      <w:hyperlink r:id="rId14">
         <w:r>
           <w:rPr>
             <w:rStyle w:val="Hyperlink"/>
@@ -5180,9 +5243,9 @@
           <w:sz w:val="36"/>
         </w:rPr>
       </w:pPr>
-      <w:bookmarkStart w:id="32" w:name="_Toc227180841"/>
-      <w:bookmarkStart w:id="33" w:name="next-steps"/>
-      <w:bookmarkEnd w:id="31"/>
+      <w:bookmarkStart w:id="32" w:name="next-steps"/>
+      <w:bookmarkStart w:id="33" w:name="_Toc227188930"/>
+      <w:bookmarkEnd w:id="30"/>
       <w:r>
         <w:rPr>
           <w:rFonts w:ascii="Aptos" w:hAnsi="Aptos"/>
@@ -5216,7 +5279,7 @@
         </w:rPr>
         <w:t>Next steps</w:t>
       </w:r>
-      <w:bookmarkEnd w:id="32"/>
+      <w:bookmarkEnd w:id="33"/>
     </w:p>
     <w:p>
       <w:pPr>
@@ -5334,12 +5397,12 @@
       <w:r>
         <w:t xml:space="preserve"> panel - it has 40+ skills covering Airflow, DVC, Evidently, Hydra, MLflow, and noted itself.</w:t>
       </w:r>
-      <w:bookmarkEnd w:id="1"/>
-      <w:bookmarkEnd w:id="33"/>
+      <w:bookmarkEnd w:id="0"/>
+      <w:bookmarkEnd w:id="32"/>
     </w:p>
     <w:sectPr>
-      <w:headerReference w:type="default" r:id="rId13"/>
-      <w:footerReference w:type="default" r:id="rId14"/>
+      <w:headerReference w:type="default" r:id="rId15"/>
+      <w:footerReference w:type="default" r:id="rId16"/>
       <w:footnotePr>
         <w:numRestart w:val="eachSect"/>
       </w:footnotePr>
@@ -7171,6 +7234,18 @@
     <w:rsid w:val="00052231"/>
     <w:rPr>
       <w:rFonts w:ascii="Aptos" w:hAnsi="Aptos"/>
+    </w:rPr>
+  </w:style>
+  <w:style w:type="character" w:styleId="UnresolvedMention">
+    <w:name w:val="Unresolved Mention"/>
+    <w:basedOn w:val="DefaultParagraphFont"/>
+    <w:uiPriority w:val="99"/>
+    <w:semiHidden/>
+    <w:unhideWhenUsed/>
+    <w:rsid w:val="008007A1"/>
+    <w:rPr>
+      <w:color w:val="605E5C"/>
+      <w:shd w:val="clear" w:color="auto" w:fill="E1DFDD"/>
     </w:rPr>
   </w:style>
 </w:styles>

</xml_diff>